<commit_message>
Arreglos técnicos y adición de mundial 2026
</commit_message>
<xml_diff>
--- a/docs/World-Cup-Data-Hub-Documentacion.docx
+++ b/docs/World-Cup-Data-Hub-Documentacion.docx
@@ -173,7 +173,7 @@
           <w:sz w:val="24"/>
           <w:szCs w:val="24"/>
         </w:rPr>
-        <w:t xml:space="preserve">Este documento explica cómo construimos World Cup Data Hub, la plataforma web que propusimos para reunir en un solo lugar la historia de la Copa Mundial de Fútbol, el Ranking FIFA y el calendario del Mundial 2026. La propuesta inicial se quedaba en el diseño conceptual: el modelo entidad-relación, las reglas de negocio, los requerimientos y los mockups. Aquí contamos qué pasó cuando ese diseño tuvo que volverse código de verdad, qué herramientas usamos, por qué las elegimos y qué cosas terminamos agregando que no estaban en el documento original. La aplicación está hecha con Next.js y React sobre TypeScript, se le da estilo con Tailwind CSS, guarda los datos en una base PostgreSQL administrada por Supabase y se publica en Vercel. Al final del documento también dejamos la lista de requerimientos funcionales con el archivo donde quedó implementado cada uno, para que se pueda verificar uno por uno.</w:t>
+        <w:t xml:space="preserve">Este documento explica cómo construimos World Cup Data Hub, la plataforma web que propusimos para reunir en un solo lugar la historia de la Copa Mundial de Fútbol, el Ranking FIFA y el calendario del Mundial 2026. La propuesta inicial se quedaba en el diseño conceptual: el modelo entidad-relación, las reglas de negocio, los requerimientos y los mockups. Aquí contamos qué pasó cuando ese diseño tuvo que volverse código de verdad, qué herramientas usamos, por qué las elegimos y qué cosas terminamos agregando que no estaban en el documento original. La aplicación está hecha con Next.js y React sobre TypeScript, se le da estilo con Tailwind CSS, guarda los datos en una base PostgreSQL administrada por Supabase y se publica en Vercel. Como el Mundial 2026 se disputó mientras desarrollábamos, la plataforma cubre hoy las 23 ediciones del torneo, de 1930 a 2026. Al final del documento también dejamos la lista de requerimientos funcionales con el archivo donde quedó implementado cada uno, para que se pueda verificar uno por uno.</w:t>
       </w:r>
     </w:p>
     <w:p>
@@ -3726,7 +3726,7 @@
                 <w:sz w:val="20"/>
                 <w:szCs w:val="20"/>
               </w:rPr>
-              <w:t xml:space="preserve">215</w:t>
+              <w:t xml:space="preserve">208</w:t>
             </w:r>
           </w:p>
         </w:tc>
@@ -5571,7 +5571,7 @@
           <w:sz w:val="24"/>
           <w:szCs w:val="24"/>
         </w:rPr>
-        <w:t xml:space="preserve">La octava migración fue la última que agregamos y es la que completó el modelo. Hasta ese momento las tablas de fases, partidos, jugadores y las cuatro intermedias solo tenían datos del Mundial 2026; toda la parte histórica vivía únicamente como texto en el frontend. Con esa migración se cargaron 111 partidos históricos con su marcador, su fase y su estadio: la fase final completa de las 22 ediciones, la ronda final de Brasil 1950, el torneo ampliado de México 1970 y todas las eliminatorias de Qatar 2022.</w:t>
+        <w:t xml:space="preserve">La octava migración es la que completó el modelo. Hasta ese momento las tablas de fases, partidos, jugadores y las cuatro intermedias solo tenían datos del Mundial 2026; toda la parte histórica vivía únicamente como texto en el frontend. Con esa migración se cargaron 111 partidos históricos con su marcador, su fase y su estadio: la fase final completa de las 22 ediciones, la ronda final de Brasil 1950, el torneo ampliado de México 1970 y todas las eliminatorias de Qatar 2022.</w:t>
       </w:r>
     </w:p>
     <w:p>
@@ -5586,7 +5586,86 @@
           <w:sz w:val="24"/>
           <w:szCs w:val="24"/>
         </w:rPr>
-        <w:t xml:space="preserve">Un detalle honesto que vale la pena dejar escrito: no cargamos los 964 partidos que se han jugado en la historia del torneo. La columna ediciones.partidos sigue guardando el total oficial de cada Mundial, y la interfaz aclara cuántos de esos partidos están cargados en detalle. Preferimos eso a inflar la base con datos que no pudiéramos verificar.</w:t>
+        <w:t xml:space="preserve">Un detalle honesto que vale la pena dejar escrito: no cargamos los 1.068 partidos que se han jugado en la historia del torneo. La columna ediciones.partidos sigue guardando el total oficial de cada Mundial, y la interfaz aclara cuántos de esos partidos están cargados en detalle. Preferimos eso a inflar la base con datos que no pudiéramos verificar.</w:t>
+      </w:r>
+    </w:p>
+    <w:p>
+      <w:pPr>
+        <w:pStyle w:val="Heading3"/>
+        <w:spacing w:after="0" w:before="0" w:line="480" w:lineRule="auto"/>
+        <w:jc w:val="left"/>
+      </w:pPr>
+      <w:r>
+        <w:rPr>
+          <w:rFonts w:ascii="Times New Roman" w:cs="Times New Roman" w:eastAsia="Times New Roman" w:hAnsi="Times New Roman"/>
+          <w:b/>
+          <w:bCs/>
+          <w:i/>
+          <w:iCs/>
+          <w:sz w:val="24"/>
+          <w:szCs w:val="24"/>
+        </w:rPr>
+        <w:t xml:space="preserve">El Mundial 2026 terminó en mitad del desarrollo</w:t>
+      </w:r>
+    </w:p>
+    <w:p>
+      <w:pPr>
+        <w:spacing w:after="0" w:before="0" w:line="480" w:lineRule="auto"/>
+        <w:ind w:firstLine="720"/>
+        <w:jc w:val="both"/>
+      </w:pPr>
+      <w:r>
+        <w:rPr>
+          <w:rFonts w:ascii="Times New Roman" w:cs="Times New Roman" w:eastAsia="Times New Roman" w:hAnsi="Times New Roman"/>
+          <w:sz w:val="24"/>
+          <w:szCs w:val="24"/>
+        </w:rPr>
+        <w:t xml:space="preserve">Esto nos obligó a la novena migración y fue el error más grande que tuvimos que corregir. Habíamos modelado el Mundial 2026 como torneo por jugarse: la edición estaba marcada con finalizada = false, sin campeón, y sus 32 llaves de eliminación eran etiquetas del tipo «Ganador SF 1» o «1.º Grupo A», porque en ese momento el sorteo no estaba resuelto.</w:t>
+      </w:r>
+    </w:p>
+    <w:p>
+      <w:pPr>
+        <w:spacing w:after="0" w:before="0" w:line="480" w:lineRule="auto"/>
+        <w:ind w:firstLine="720"/>
+        <w:jc w:val="both"/>
+      </w:pPr>
+      <w:r>
+        <w:rPr>
+          <w:rFonts w:ascii="Times New Roman" w:cs="Times New Roman" w:eastAsia="Times New Roman" w:hAnsi="Times New Roman"/>
+          <w:sz w:val="24"/>
+          <w:szCs w:val="24"/>
+        </w:rPr>
+        <w:t xml:space="preserve">El torneo se jugó del 11 de junio al 19 de julio de 2026 y lo ganó España, que le ganó 1-0 a Argentina en la prórroga de la final, en el MetLife Stadium, con gol de Ferran Torres al minuto 106. Inglaterra fue tercera tras vencer 6-4 a Francia, el partido con más goles jamás jugado por el tercer puesto. Kylian Mbappé se llevó la Bota de Oro con 10 goles y el torneo cerró con 6.810.966 espectadores, un promedio de 65.490 por partido.</w:t>
+      </w:r>
+    </w:p>
+    <w:p>
+      <w:pPr>
+        <w:spacing w:after="0" w:before="0" w:line="480" w:lineRule="auto"/>
+        <w:ind w:firstLine="720"/>
+        <w:jc w:val="both"/>
+      </w:pPr>
+      <w:r>
+        <w:rPr>
+          <w:rFonts w:ascii="Times New Roman" w:cs="Times New Roman" w:eastAsia="Times New Roman" w:hAnsi="Times New Roman"/>
+          <w:sz w:val="24"/>
+          <w:szCs w:val="24"/>
+        </w:rPr>
+        <w:t xml:space="preserve">Mientras no actualizamos eso, la aplicación seguía mostrando cosas absurdas: un panel de «próximos partidos» de un torneo terminado, un rango de datos que iba de 1930 a 2022 y un historial en el que la última edición era Qatar 2022. La lección para nosotros fue clara: los datos que dependen del tiempo no se pueden dejar escritos como si el presente no se moviera. Cambiar una sola fila de la tabla ediciones (poner el campeón y marcar finalizada = true) hizo que las métricas, el historial y el destacado se actualizaran solos, porque el rango de años y los contadores se calculan de la base y no están escritos a mano en la interfaz.</w:t>
+      </w:r>
+    </w:p>
+    <w:p>
+      <w:pPr>
+        <w:spacing w:after="0" w:before="0" w:line="480" w:lineRule="auto"/>
+        <w:ind w:firstLine="720"/>
+        <w:jc w:val="both"/>
+      </w:pPr>
+      <w:r>
+        <w:rPr>
+          <w:rFonts w:ascii="Times New Roman" w:cs="Times New Roman" w:eastAsia="Times New Roman" w:hAnsi="Times New Roman"/>
+          <w:sz w:val="24"/>
+          <w:szCs w:val="24"/>
+        </w:rPr>
+        <w:t xml:space="preserve">De la fase de eliminación cargamos los 25 partidos que pudimos verificar contra varias fuentes: los ocho de octavos, los cuatro de cuartos, las dos semifinales, el partido por el tercer puesto, la final y nueve de los dieciseisavos. El cuadro cierra solo, que es la mejor comprobación que teníamos a la mano: los ocho ganadores de octavos son exactamente los ocho equipos que aparecen en cuartos. La fase de grupos conserva el sorteo que nosotros armamos en la propuesta, que no coincide con el sorteo real, y por eso sus 72 partidos siguen sin marcador.</w:t>
       </w:r>
     </w:p>
     <w:p>
@@ -7654,6 +7733,38 @@
           <w:sz w:val="24"/>
           <w:szCs w:val="24"/>
         </w:rPr>
+        <w:t xml:space="preserve">Cierre de la edición 2026</w:t>
+      </w:r>
+    </w:p>
+    <w:p>
+      <w:pPr>
+        <w:spacing w:after="0" w:before="0" w:line="480" w:lineRule="auto"/>
+        <w:ind w:firstLine="720"/>
+        <w:jc w:val="both"/>
+      </w:pPr>
+      <w:r>
+        <w:rPr>
+          <w:rFonts w:ascii="Times New Roman" w:cs="Times New Roman" w:eastAsia="Times New Roman" w:hAnsi="Times New Roman"/>
+          <w:sz w:val="24"/>
+          <w:szCs w:val="24"/>
+        </w:rPr>
+        <w:t xml:space="preserve">La propuesta se escribió con el Mundial 2026 todavía por jugarse, así que toda la aplicación lo trataba como un torneo futuro. Cuando terminó tocó cerrarlo: cargar el campeón, el subcampeón, el goleador y las cifras de asistencia, cambiar los rótulos que hablaban en futuro y reemplazar las llaves sin sortear por los resultados. Lo contamos en detalle en la sección de la base de datos porque terminó siendo tanto un cambio de datos como una lección de diseño.</w:t>
+      </w:r>
+    </w:p>
+    <w:p>
+      <w:pPr>
+        <w:pStyle w:val="Heading2"/>
+        <w:spacing w:after="0" w:before="0" w:line="480" w:lineRule="auto"/>
+        <w:jc w:val="left"/>
+      </w:pPr>
+      <w:r>
+        <w:rPr>
+          <w:rFonts w:ascii="Times New Roman" w:cs="Times New Roman" w:eastAsia="Times New Roman" w:hAnsi="Times New Roman"/>
+          <w:b/>
+          <w:bCs/>
+          <w:sz w:val="24"/>
+          <w:szCs w:val="24"/>
+        </w:rPr>
         <w:t xml:space="preserve">Arreglos de interfaz</w:t>
       </w:r>
     </w:p>
@@ -9179,7 +9290,22 @@
           <w:sz w:val="24"/>
           <w:szCs w:val="24"/>
         </w:rPr>
-        <w:t xml:space="preserve">Como trabajo pendiente queda completar el histórico de partidos. Hoy están cargados 111 de los 964 que se han jugado, que son los que pudimos verificar. Ampliarlo no requiere cambiar nada del sistema: basta con agregar las filas al script de datos y volver a generar la migración, que es precisamente lo que buscábamos al dejar el conjunto de datos generado por script y no escrito a mano.</w:t>
+        <w:t xml:space="preserve">Lo cuarto lo aprendimos por las malas cuando terminó el Mundial 2026: un dato que depende de la fecha envejece solo. Nuestra propuesta hablaba de 22 ediciones porque en ese momento eran 22, y la aplicación heredó esa cifra en varios lugares. Al final la única forma de que no se volviera a desactualizar fue dejar de escribir el rango a mano y calcularlo siempre de la base.</w:t>
+      </w:r>
+    </w:p>
+    <w:p>
+      <w:pPr>
+        <w:spacing w:after="0" w:before="0" w:line="480" w:lineRule="auto"/>
+        <w:ind w:firstLine="720"/>
+        <w:jc w:val="both"/>
+      </w:pPr>
+      <w:r>
+        <w:rPr>
+          <w:rFonts w:ascii="Times New Roman" w:cs="Times New Roman" w:eastAsia="Times New Roman" w:hAnsi="Times New Roman"/>
+          <w:sz w:val="24"/>
+          <w:szCs w:val="24"/>
+        </w:rPr>
+        <w:t xml:space="preserve">Como trabajo pendiente queda completar el histórico de partidos. Hoy están cargados 136 de los 1.068 que se han jugado, que son los que pudimos verificar. Ampliarlo no requiere cambiar nada del sistema: basta con agregar las filas al script de datos y volver a generar la migración, que es precisamente lo que buscábamos al dejar el conjunto de datos generado por script y no escrito a mano. Falta también reemplazar el sorteo de la fase de grupos de 2026 por el sorteo real.</w:t>
       </w:r>
     </w:p>
     <w:p>

</xml_diff>